<commit_message>
diplomski rad i prezentacija
</commit_message>
<xml_diff>
--- a/FTN_BSc_BorisLetic.docx
+++ b/FTN_BSc_BorisLetic.docx
@@ -63,7 +63,7 @@
                 <v:shape id="_x0000_i1025" type="#_x0000_t75" alt="" style="width:64.8pt;height:64.8pt;mso-width-percent:0;mso-height-percent:0;mso-width-percent:0;mso-height-percent:0" o:ole="" fillcolor="window">
                   <v:imagedata r:id="rId8" o:title=""/>
                 </v:shape>
-                <o:OLEObject Type="Embed" ProgID="CorelDraw.Graphic.7" ShapeID="_x0000_i1025" DrawAspect="Content" ObjectID="_1825428473" r:id="rId9"/>
+                <o:OLEObject Type="Embed" ProgID="CorelDraw.Graphic.7" ShapeID="_x0000_i1025" DrawAspect="Content" ObjectID="_1825433309" r:id="rId9"/>
               </w:object>
             </w:r>
           </w:p>
@@ -2881,42 +2881,32 @@
                 <w:color w:val="000000" w:themeColor="text1"/>
                 <w:sz w:val="18"/>
               </w:rPr>
-              <w:t>7/3</w:t>
+              <w:t>5</w:t>
             </w:r>
             <w:r>
               <w:rPr>
                 <w:rFonts w:ascii="Arial" w:hAnsi="Arial"/>
                 <w:color w:val="000000" w:themeColor="text1"/>
                 <w:sz w:val="18"/>
-                <w:lang w:val="sr-Cyrl-RS"/>
-              </w:rPr>
-              <w:t>3</w:t>
+              </w:rPr>
+              <w:t>/3</w:t>
             </w:r>
             <w:r>
               <w:rPr>
                 <w:rFonts w:ascii="Arial" w:hAnsi="Arial"/>
                 <w:color w:val="000000" w:themeColor="text1"/>
                 <w:sz w:val="18"/>
-              </w:rPr>
-              <w:t>/0/0/</w:t>
-            </w:r>
-            <w:proofErr w:type="gramStart"/>
+                <w:lang w:val="sr-Cyrl-RS"/>
+              </w:rPr>
+              <w:t>3</w:t>
+            </w:r>
             <w:r>
               <w:rPr>
                 <w:rFonts w:ascii="Arial" w:hAnsi="Arial"/>
                 <w:color w:val="000000" w:themeColor="text1"/>
                 <w:sz w:val="18"/>
               </w:rPr>
-              <w:t>12/0</w:t>
-            </w:r>
-            <w:proofErr w:type="gramEnd"/>
-            <w:r>
-              <w:rPr>
-                <w:rFonts w:ascii="Arial" w:hAnsi="Arial"/>
-                <w:color w:val="000000" w:themeColor="text1"/>
-                <w:sz w:val="18"/>
-              </w:rPr>
-              <w:t>/0</w:t>
+              <w:t>/0/0/12/0/0</w:t>
             </w:r>
           </w:p>
         </w:tc>
@@ -7856,7 +7846,15 @@
                 <w:color w:val="000000" w:themeColor="text1"/>
                 <w:sz w:val="18"/>
               </w:rPr>
-              <w:t>7/3</w:t>
+              <w:t>5</w:t>
+            </w:r>
+            <w:r>
+              <w:rPr>
+                <w:rFonts w:ascii="Arial" w:hAnsi="Arial"/>
+                <w:color w:val="000000" w:themeColor="text1"/>
+                <w:sz w:val="18"/>
+              </w:rPr>
+              <w:t>/3</w:t>
             </w:r>
             <w:r>
               <w:rPr>
@@ -39723,7 +39721,6 @@
         </w:rPr>
       </w:pPr>
       <w:proofErr w:type="spellStart"/>
-      <w:proofErr w:type="gramStart"/>
       <w:r>
         <w:rPr>
           <w:rFonts w:ascii="Calibri" w:hAnsi="Calibri" w:cs="Calibri" w:hint="eastAsia"/>
@@ -39739,16 +39736,7 @@
           <w:sz w:val="24"/>
           <w:szCs w:val="24"/>
         </w:rPr>
-        <w:t>: „</w:t>
-      </w:r>
-      <w:proofErr w:type="gramEnd"/>
-      <w:r>
-        <w:rPr>
-          <w:rFonts w:ascii="Calibri" w:hAnsi="Calibri" w:cs="Calibri"/>
-          <w:sz w:val="24"/>
-          <w:szCs w:val="24"/>
-        </w:rPr>
-        <w:t>Some people think Bitcoin is bad, others good" (</w:t>
+        <w:t>: „Some people think Bitcoin is bad, others good" (</w:t>
       </w:r>
       <w:proofErr w:type="spellStart"/>
       <w:r>

</xml_diff>